<commit_message>
docs: imrove the presentation and schema
</commit_message>
<xml_diff>
--- a/План презентации.docx
+++ b/План презентации.docx
@@ -360,8 +360,8 @@
     </w:p>
     <w:p>
       <w:pPr>
-        <w:spacing w:before="100" w:beforeAutospacing="1" w:after="100" w:afterAutospacing="1" w:line="240" w:lineRule="auto"/>
-        <w:ind w:left="360"/>
+        <w:spacing w:after="0" w:line="240" w:lineRule="auto"/>
+        <w:ind w:left="357" w:firstLine="352"/>
         <w:rPr>
           <w:rFonts w:ascii="Times New Roman" w:eastAsia="Times New Roman" w:hAnsi="Times New Roman" w:cs="Times New Roman"/>
           <w:sz w:val="24"/>
@@ -449,23 +449,26 @@
         </w:rPr>
         <w:t>.</w:t>
       </w:r>
-      <w:r>
-        <w:rPr>
-          <w:rFonts w:ascii="Times New Roman" w:eastAsia="Times New Roman" w:hAnsi="Times New Roman" w:cs="Times New Roman"/>
-          <w:sz w:val="24"/>
-          <w:szCs w:val="24"/>
-          <w:lang w:eastAsia="ru-RU"/>
-        </w:rPr>
-        <w:br/>
-      </w:r>
-      <w:r>
-        <w:rPr>
-          <w:rFonts w:ascii="Times New Roman" w:eastAsia="Times New Roman" w:hAnsi="Times New Roman" w:cs="Times New Roman"/>
-          <w:sz w:val="24"/>
-          <w:szCs w:val="24"/>
-          <w:lang w:eastAsia="ru-RU"/>
-        </w:rPr>
-        <w:t xml:space="preserve"> Сегодня представим наш финальный проект — </w:t>
+    </w:p>
+    <w:p>
+      <w:pPr>
+        <w:spacing w:after="0" w:line="240" w:lineRule="auto"/>
+        <w:ind w:left="357" w:firstLine="352"/>
+        <w:rPr>
+          <w:rFonts w:ascii="Times New Roman" w:eastAsia="Times New Roman" w:hAnsi="Times New Roman" w:cs="Times New Roman"/>
+          <w:sz w:val="24"/>
+          <w:szCs w:val="24"/>
+          <w:lang w:eastAsia="ru-RU"/>
+        </w:rPr>
+      </w:pPr>
+      <w:r>
+        <w:rPr>
+          <w:rFonts w:ascii="Times New Roman" w:eastAsia="Times New Roman" w:hAnsi="Times New Roman" w:cs="Times New Roman"/>
+          <w:sz w:val="24"/>
+          <w:szCs w:val="24"/>
+          <w:lang w:eastAsia="ru-RU"/>
+        </w:rPr>
+        <w:t xml:space="preserve">Сегодня представим наш финальный проект — </w:t>
       </w:r>
       <w:proofErr w:type="spellStart"/>
       <w:r>
@@ -494,7 +497,64 @@
           <w:szCs w:val="24"/>
           <w:lang w:eastAsia="ru-RU"/>
         </w:rPr>
-        <w:t>позволяющее пользователям управлять своей личной базой данных фильмов. Пользователи могут зарегистрироваться или войти в систему,</w:t>
+        <w:t>позволяющее пользователям</w:t>
+      </w:r>
+      <w:r>
+        <w:rPr>
+          <w:rFonts w:ascii="Times New Roman" w:eastAsia="Times New Roman" w:hAnsi="Times New Roman" w:cs="Times New Roman"/>
+          <w:sz w:val="24"/>
+          <w:szCs w:val="24"/>
+          <w:lang w:eastAsia="ru-RU"/>
+        </w:rPr>
+        <w:t xml:space="preserve"> </w:t>
+      </w:r>
+      <w:r>
+        <w:rPr>
+          <w:rFonts w:ascii="Times New Roman" w:eastAsia="Times New Roman" w:hAnsi="Times New Roman" w:cs="Times New Roman"/>
+          <w:sz w:val="24"/>
+          <w:szCs w:val="24"/>
+          <w:lang w:eastAsia="ru-RU"/>
+        </w:rPr>
+        <w:t>получать информацию о фильмах и актёрах,</w:t>
+      </w:r>
+      <w:r>
+        <w:rPr>
+          <w:rFonts w:ascii="Times New Roman" w:eastAsia="Times New Roman" w:hAnsi="Times New Roman" w:cs="Times New Roman"/>
+          <w:sz w:val="24"/>
+          <w:szCs w:val="24"/>
+          <w:lang w:eastAsia="ru-RU"/>
+        </w:rPr>
+        <w:t xml:space="preserve"> управлять сво</w:t>
+      </w:r>
+      <w:r>
+        <w:rPr>
+          <w:rFonts w:ascii="Times New Roman" w:eastAsia="Times New Roman" w:hAnsi="Times New Roman" w:cs="Times New Roman"/>
+          <w:sz w:val="24"/>
+          <w:szCs w:val="24"/>
+          <w:lang w:eastAsia="ru-RU"/>
+        </w:rPr>
+        <w:t>ей личной базой данных фильмов.</w:t>
+      </w:r>
+    </w:p>
+    <w:p>
+      <w:pPr>
+        <w:spacing w:after="0" w:line="240" w:lineRule="auto"/>
+        <w:ind w:left="357" w:firstLine="352"/>
+        <w:rPr>
+          <w:rFonts w:ascii="Times New Roman" w:eastAsia="Times New Roman" w:hAnsi="Times New Roman" w:cs="Times New Roman"/>
+          <w:sz w:val="24"/>
+          <w:szCs w:val="24"/>
+          <w:lang w:eastAsia="ru-RU"/>
+        </w:rPr>
+      </w:pPr>
+      <w:r>
+        <w:rPr>
+          <w:rFonts w:ascii="Times New Roman" w:eastAsia="Times New Roman" w:hAnsi="Times New Roman" w:cs="Times New Roman"/>
+          <w:sz w:val="24"/>
+          <w:szCs w:val="24"/>
+          <w:lang w:eastAsia="ru-RU"/>
+        </w:rPr>
+        <w:t>Пользователи могут зарегистрироваться или войти в систему,</w:t>
       </w:r>
       <w:r>
         <w:rPr>
@@ -550,16 +610,16 @@
           <w:szCs w:val="24"/>
           <w:lang w:eastAsia="ru-RU"/>
         </w:rPr>
-        <w:t xml:space="preserve"> создавать персональные коллекции, такие как «Избранное», «Просмотр</w:t>
-      </w:r>
-      <w:r>
-        <w:rPr>
-          <w:rFonts w:ascii="Times New Roman" w:eastAsia="Times New Roman" w:hAnsi="Times New Roman" w:cs="Times New Roman"/>
-          <w:sz w:val="24"/>
-          <w:szCs w:val="24"/>
-          <w:lang w:eastAsia="ru-RU"/>
-        </w:rPr>
-        <w:t>ено» или «Хочу посмотреть».</w:t>
+        <w:t xml:space="preserve"> со</w:t>
+      </w:r>
+      <w:r>
+        <w:rPr>
+          <w:rFonts w:ascii="Times New Roman" w:eastAsia="Times New Roman" w:hAnsi="Times New Roman" w:cs="Times New Roman"/>
+          <w:sz w:val="24"/>
+          <w:szCs w:val="24"/>
+          <w:lang w:eastAsia="ru-RU"/>
+        </w:rPr>
+        <w:t>здавать персональные коллекции.</w:t>
       </w:r>
     </w:p>
     <w:p>
@@ -735,18 +795,7 @@
           <w:szCs w:val="24"/>
           <w:lang w:val="en-US" w:eastAsia="ru-RU"/>
         </w:rPr>
-        <w:t>.</w:t>
-      </w:r>
-      <w:bookmarkStart w:id="0" w:name="_GoBack"/>
-      <w:bookmarkEnd w:id="0"/>
-      <w:r>
-        <w:rPr>
-          <w:rFonts w:ascii="Times New Roman" w:eastAsia="Times New Roman" w:hAnsi="Times New Roman" w:cs="Times New Roman"/>
-          <w:sz w:val="24"/>
-          <w:szCs w:val="24"/>
-          <w:lang w:val="en-US" w:eastAsia="ru-RU"/>
-        </w:rPr>
-        <w:t xml:space="preserve"> </w:t>
+        <w:t xml:space="preserve">. </w:t>
       </w:r>
       <w:proofErr w:type="spellStart"/>
       <w:r>
@@ -1335,7 +1384,7 @@
           <w:rFonts w:ascii="Times New Roman" w:eastAsia="Times New Roman" w:hAnsi="Times New Roman" w:cs="Times New Roman"/>
           <w:sz w:val="24"/>
           <w:szCs w:val="24"/>
-          <w:lang w:val="en-US" w:eastAsia="ru-RU"/>
+          <w:lang w:eastAsia="ru-RU"/>
         </w:rPr>
       </w:pPr>
       <w:r>
@@ -1541,10 +1590,7 @@
         <w:ind w:firstLine="425"/>
       </w:pPr>
       <w:r>
-        <w:t>М</w:t>
-      </w:r>
-      <w:r>
-        <w:t>ы выстроили процесс максимально близкий к реальной разработке.</w:t>
+        <w:t>Мы выстроили процесс максимально близкий к реальной разработке.</w:t>
       </w:r>
       <w:r>
         <w:br/>
@@ -1584,7 +1630,10 @@
       </w:r>
       <w:proofErr w:type="spellStart"/>
       <w:r>
-        <w:t>Issue</w:t>
+        <w:t>Iss</w:t>
+      </w:r>
+      <w:r>
+        <w:t>ue</w:t>
       </w:r>
       <w:proofErr w:type="spellEnd"/>
       <w:r>
@@ -1594,11 +1643,6 @@
       <w:r>
         <w:t>To</w:t>
       </w:r>
-      <w:proofErr w:type="spellEnd"/>
-      <w:r>
-        <w:t xml:space="preserve"> </w:t>
-      </w:r>
-      <w:proofErr w:type="spellStart"/>
       <w:r>
         <w:t>Do</w:t>
       </w:r>
@@ -1622,13 +1666,7 @@
         <w:ind w:firstLine="425"/>
       </w:pPr>
       <w:r>
-        <w:t xml:space="preserve">Работу синхронизировали через регулярные </w:t>
-      </w:r>
-      <w:r>
-        <w:t>чаты</w:t>
-      </w:r>
-      <w:r>
-        <w:t xml:space="preserve"> в </w:t>
+        <w:t xml:space="preserve">Работу синхронизировали через регулярные чаты в </w:t>
       </w:r>
       <w:proofErr w:type="spellStart"/>
       <w:r>
@@ -1658,11 +1696,26 @@
       </w:r>
       <w:proofErr w:type="spellStart"/>
       <w:r>
-        <w:t>requests</w:t>
-      </w:r>
-      <w:proofErr w:type="spellEnd"/>
-      <w:r>
-        <w:t xml:space="preserve"> и обязательный код-ревью — это помогало держать единый стиль и вовремя находить ошибки.</w:t>
+        <w:t>req</w:t>
+      </w:r>
+      <w:r>
+        <w:t>uests</w:t>
+      </w:r>
+      <w:proofErr w:type="spellEnd"/>
+      <w:r>
+        <w:t xml:space="preserve"> и обязательный код-ревью</w:t>
+      </w:r>
+      <w:proofErr w:type="gramStart"/>
+      <w:r>
+        <w:t xml:space="preserve"> </w:t>
+      </w:r>
+      <w:r>
+        <w:softHyphen/>
+        <w:t>,</w:t>
+      </w:r>
+      <w:proofErr w:type="gramEnd"/>
+      <w:r>
+        <w:t xml:space="preserve"> это помогало держать единый стиль и вовремя находить ошибки.</w:t>
       </w:r>
     </w:p>
     <w:p>
@@ -1707,7 +1760,7 @@
           <w:bCs/>
           <w:sz w:val="36"/>
           <w:szCs w:val="36"/>
-          <w:lang w:eastAsia="ru-RU"/>
+          <w:lang w:val="en-US" w:eastAsia="ru-RU"/>
         </w:rPr>
       </w:pPr>
       <w:r>
@@ -1720,29 +1773,6 @@
           <w:lang w:eastAsia="ru-RU"/>
         </w:rPr>
         <w:t>3. Цель и описание проекта</w:t>
-      </w:r>
-      <w:r>
-        <w:rPr>
-          <w:rFonts w:ascii="Times New Roman" w:eastAsia="Times New Roman" w:hAnsi="Times New Roman" w:cs="Times New Roman"/>
-          <w:b/>
-          <w:bCs/>
-          <w:sz w:val="36"/>
-          <w:szCs w:val="36"/>
-          <w:lang w:eastAsia="ru-RU"/>
-        </w:rPr>
-        <w:t xml:space="preserve"> </w:t>
-      </w:r>
-      <w:r>
-        <w:rPr>
-          <w:rFonts w:ascii="Times New Roman" w:eastAsia="Times New Roman" w:hAnsi="Times New Roman" w:cs="Times New Roman"/>
-          <w:b/>
-          <w:bCs/>
-          <w:color w:val="FF0000"/>
-          <w:sz w:val="24"/>
-          <w:szCs w:val="24"/>
-          <w:lang w:eastAsia="ru-RU"/>
-        </w:rPr>
-        <w:t>(может вообще исключить?)</w:t>
       </w:r>
     </w:p>
     <w:p>
@@ -1944,7 +1974,25 @@
           <w:szCs w:val="24"/>
           <w:lang w:eastAsia="ru-RU"/>
         </w:rPr>
-        <w:t>ацию, фильтрацию/поиск и личные коллекции.</w:t>
+        <w:t xml:space="preserve">ацию, </w:t>
+      </w:r>
+      <w:r>
+        <w:rPr>
+          <w:rFonts w:ascii="Times New Roman" w:eastAsia="Times New Roman" w:hAnsi="Times New Roman" w:cs="Times New Roman"/>
+          <w:sz w:val="24"/>
+          <w:szCs w:val="24"/>
+          <w:lang w:eastAsia="ru-RU"/>
+        </w:rPr>
+        <w:t>фильтрацию/поиск, составление и просмотр личных коллекций</w:t>
+      </w:r>
+      <w:r>
+        <w:rPr>
+          <w:rFonts w:ascii="Times New Roman" w:eastAsia="Times New Roman" w:hAnsi="Times New Roman" w:cs="Times New Roman"/>
+          <w:sz w:val="24"/>
+          <w:szCs w:val="24"/>
+          <w:lang w:eastAsia="ru-RU"/>
+        </w:rPr>
+        <w:t>.</w:t>
       </w:r>
     </w:p>
     <w:p>
@@ -2001,43 +2049,19 @@
         <w:ind w:left="720"/>
         <w:rPr>
           <w:rFonts w:ascii="Times New Roman" w:eastAsia="Times New Roman" w:hAnsi="Times New Roman" w:cs="Times New Roman"/>
-          <w:color w:val="FF0000"/>
-          <w:sz w:val="24"/>
-          <w:szCs w:val="24"/>
-          <w:lang w:eastAsia="ru-RU"/>
-        </w:rPr>
-      </w:pPr>
-      <w:r>
-        <w:rPr>
-          <w:rFonts w:ascii="Times New Roman" w:eastAsia="Times New Roman" w:hAnsi="Times New Roman" w:cs="Times New Roman"/>
-          <w:color w:val="FF0000"/>
-          <w:sz w:val="24"/>
-          <w:szCs w:val="24"/>
-          <w:lang w:eastAsia="ru-RU"/>
-        </w:rPr>
-        <w:t xml:space="preserve">структура кода, модули и компоненты - не очень </w:t>
-      </w:r>
-      <w:proofErr w:type="gramStart"/>
-      <w:r>
-        <w:rPr>
-          <w:rFonts w:ascii="Times New Roman" w:eastAsia="Times New Roman" w:hAnsi="Times New Roman" w:cs="Times New Roman"/>
-          <w:color w:val="FF0000"/>
-          <w:sz w:val="24"/>
-          <w:szCs w:val="24"/>
-          <w:lang w:eastAsia="ru-RU"/>
-        </w:rPr>
-        <w:t>понимаю</w:t>
-      </w:r>
-      <w:proofErr w:type="gramEnd"/>
-      <w:r>
-        <w:rPr>
-          <w:rFonts w:ascii="Times New Roman" w:eastAsia="Times New Roman" w:hAnsi="Times New Roman" w:cs="Times New Roman"/>
-          <w:color w:val="FF0000"/>
-          <w:sz w:val="24"/>
-          <w:szCs w:val="24"/>
-          <w:lang w:eastAsia="ru-RU"/>
-        </w:rPr>
-        <w:t xml:space="preserve"> что требуется тут.</w:t>
+          <w:sz w:val="24"/>
+          <w:szCs w:val="24"/>
+          <w:lang w:eastAsia="ru-RU"/>
+        </w:rPr>
+      </w:pPr>
+      <w:r>
+        <w:rPr>
+          <w:rFonts w:ascii="Times New Roman" w:eastAsia="Times New Roman" w:hAnsi="Times New Roman" w:cs="Times New Roman"/>
+          <w:sz w:val="24"/>
+          <w:szCs w:val="24"/>
+          <w:lang w:eastAsia="ru-RU"/>
+        </w:rPr>
+        <w:t>Диаграмма:</w:t>
       </w:r>
     </w:p>
     <w:p>
@@ -2058,40 +2082,21 @@
           <w:szCs w:val="24"/>
           <w:lang w:eastAsia="ru-RU"/>
         </w:rPr>
-        <w:t>Диаграмма:</w:t>
-      </w:r>
-    </w:p>
-    <w:p>
-      <w:pPr>
-        <w:spacing w:before="100" w:beforeAutospacing="1" w:after="100" w:afterAutospacing="1" w:line="240" w:lineRule="auto"/>
-        <w:ind w:left="720"/>
-        <w:rPr>
-          <w:rFonts w:ascii="Times New Roman" w:eastAsia="Times New Roman" w:hAnsi="Times New Roman" w:cs="Times New Roman"/>
-          <w:sz w:val="24"/>
-          <w:szCs w:val="24"/>
-          <w:lang w:eastAsia="ru-RU"/>
-        </w:rPr>
-      </w:pPr>
-      <w:r>
-        <w:rPr>
-          <w:rFonts w:ascii="Times New Roman" w:eastAsia="Times New Roman" w:hAnsi="Times New Roman" w:cs="Times New Roman"/>
-          <w:sz w:val="24"/>
-          <w:szCs w:val="24"/>
-          <w:lang w:eastAsia="ru-RU"/>
-        </w:rPr>
         <w:t xml:space="preserve"> </w:t>
       </w:r>
       <w:r>
         <w:rPr>
-          <w:rFonts w:cstheme="minorHAnsi"/>
+          <w:rFonts w:ascii="Times New Roman" w:eastAsia="Times New Roman" w:hAnsi="Times New Roman" w:cs="Times New Roman"/>
           <w:noProof/>
+          <w:sz w:val="24"/>
+          <w:szCs w:val="24"/>
           <w:lang w:eastAsia="ru-RU"/>
         </w:rPr>
         <w:drawing>
-          <wp:inline distT="0" distB="0" distL="0" distR="0" wp14:anchorId="37A026FB" wp14:editId="16043AD6">
-            <wp:extent cx="1104182" cy="871470"/>
-            <wp:effectExtent l="0" t="0" r="1270" b="5080"/>
-            <wp:docPr id="2" name="Рисунок 2"/>
+          <wp:inline distT="0" distB="0" distL="0" distR="0" wp14:anchorId="5476A3A7" wp14:editId="66711B7A">
+            <wp:extent cx="1966823" cy="2417935"/>
+            <wp:effectExtent l="0" t="0" r="0" b="1905"/>
+            <wp:docPr id="3074" name="Picture 2"/>
             <wp:cNvGraphicFramePr>
               <a:graphicFrameLocks xmlns:a="http://schemas.openxmlformats.org/drawingml/2006/main" noChangeAspect="1"/>
             </wp:cNvGraphicFramePr>
@@ -2099,23 +2104,38 @@
               <a:graphicData uri="http://schemas.openxmlformats.org/drawingml/2006/picture">
                 <pic:pic xmlns:pic="http://schemas.openxmlformats.org/drawingml/2006/picture">
                   <pic:nvPicPr>
-                    <pic:cNvPr id="0" name=""/>
-                    <pic:cNvPicPr/>
+                    <pic:cNvPr id="3074" name="Picture 2"/>
+                    <pic:cNvPicPr>
+                      <a:picLocks noChangeAspect="1" noChangeArrowheads="1"/>
+                    </pic:cNvPicPr>
                   </pic:nvPicPr>
                   <pic:blipFill>
-                    <a:blip r:embed="rId11"/>
+                    <a:blip r:embed="rId11" cstate="print">
+                      <a:extLst>
+                        <a:ext uri="{28A0092B-C50C-407E-A947-70E740481C1C}">
+                          <a14:useLocalDpi xmlns:a14="http://schemas.microsoft.com/office/drawing/2010/main" val="0"/>
+                        </a:ext>
+                      </a:extLst>
+                    </a:blip>
+                    <a:srcRect/>
                     <a:stretch>
                       <a:fillRect/>
                     </a:stretch>
                   </pic:blipFill>
-                  <pic:spPr>
+                  <pic:spPr bwMode="auto">
                     <a:xfrm>
                       <a:off x="0" y="0"/>
-                      <a:ext cx="1105225" cy="872293"/>
+                      <a:ext cx="1966250" cy="2417231"/>
                     </a:xfrm>
                     <a:prstGeom prst="rect">
                       <a:avLst/>
                     </a:prstGeom>
+                    <a:noFill/>
+                    <a:ln>
+                      <a:noFill/>
+                    </a:ln>
+                    <a:effectLst/>
+                    <a:extLst/>
                   </pic:spPr>
                 </pic:pic>
               </a:graphicData>
@@ -2403,26 +2423,6 @@
           <w:szCs w:val="24"/>
           <w:lang w:eastAsia="ru-RU"/>
         </w:rPr>
-        <w:t xml:space="preserve"> </w:t>
-      </w:r>
-      <w:proofErr w:type="spellStart"/>
-      <w:r>
-        <w:rPr>
-          <w:rFonts w:ascii="Times New Roman" w:eastAsia="Times New Roman" w:hAnsi="Times New Roman" w:cs="Times New Roman"/>
-          <w:sz w:val="24"/>
-          <w:szCs w:val="24"/>
-          <w:lang w:eastAsia="ru-RU"/>
-        </w:rPr>
-        <w:t>TMDb</w:t>
-      </w:r>
-      <w:proofErr w:type="spellEnd"/>
-      <w:r>
-        <w:rPr>
-          <w:rFonts w:ascii="Times New Roman" w:eastAsia="Times New Roman" w:hAnsi="Times New Roman" w:cs="Times New Roman"/>
-          <w:sz w:val="24"/>
-          <w:szCs w:val="24"/>
-          <w:lang w:eastAsia="ru-RU"/>
-        </w:rPr>
         <w:t xml:space="preserve"> API для фильмов и с нашим </w:t>
       </w:r>
       <w:proofErr w:type="spellStart"/>
@@ -2820,33 +2820,36 @@
       <w:pPr>
         <w:pStyle w:val="a3"/>
         <w:spacing w:before="0" w:beforeAutospacing="0" w:after="0" w:afterAutospacing="0"/>
+      </w:pPr>
+      <w:r>
+        <w:rPr>
+          <w:rFonts w:hAnsi="Symbol"/>
+        </w:rPr>
+        <w:t></w:t>
+      </w:r>
+      <w:r>
+        <w:t xml:space="preserve">  </w:t>
+      </w:r>
+      <w:r>
         <w:rPr>
           <w:lang w:val="en-US"/>
         </w:rPr>
-      </w:pPr>
-      <w:r>
-        <w:rPr>
-          <w:rFonts w:hAnsi="Symbol"/>
-        </w:rPr>
-        <w:t></w:t>
+        <w:t>S</w:t>
       </w:r>
       <w:r>
         <w:rPr>
           <w:lang w:val="en-US"/>
         </w:rPr>
-        <w:t xml:space="preserve">  </w:t>
+        <w:t>emantic</w:t>
+      </w:r>
+      <w:r>
+        <w:t>-</w:t>
       </w:r>
       <w:r>
         <w:rPr>
           <w:lang w:val="en-US"/>
         </w:rPr>
-        <w:t>S</w:t>
-      </w:r>
-      <w:r>
-        <w:rPr>
-          <w:lang w:val="en-US"/>
-        </w:rPr>
-        <w:t>emantic-release</w:t>
+        <w:t>release</w:t>
       </w:r>
     </w:p>
     <w:p>
@@ -2857,7 +2860,6 @@
           <w:b/>
           <w:color w:val="00B050"/>
           <w:u w:val="single"/>
-          <w:lang w:val="en-US"/>
         </w:rPr>
       </w:pPr>
       <w:r>
@@ -2873,7 +2875,6 @@
           <w:b/>
           <w:color w:val="00B050"/>
           <w:u w:val="single"/>
-          <w:lang w:val="en-US"/>
         </w:rPr>
         <w:t>:</w:t>
       </w:r>
@@ -2964,6 +2965,7 @@
         <w:ind w:firstLine="426"/>
       </w:pPr>
       <w:r>
+        <w:lastRenderedPageBreak/>
         <w:t xml:space="preserve">Для процессов CI/CD мы настроили </w:t>
       </w:r>
       <w:proofErr w:type="spellStart"/>
@@ -3043,9 +3045,6 @@
       <w:pPr>
         <w:pStyle w:val="a3"/>
         <w:ind w:firstLine="426"/>
-        <w:rPr>
-          <w:lang w:val="en-US"/>
-        </w:rPr>
       </w:pPr>
       <w:r>
         <w:t xml:space="preserve">Кроме того, мы следили за качеством кода с помощью </w:t>
@@ -3059,18 +3058,27 @@
       </w:r>
       <w:proofErr w:type="spellEnd"/>
       <w:r>
-        <w:t xml:space="preserve">, форматировали его через </w:t>
-      </w:r>
-      <w:proofErr w:type="spellStart"/>
-      <w:r>
         <w:rPr>
           <w:rStyle w:val="a4"/>
         </w:rPr>
+        <w:t xml:space="preserve"> и</w:t>
+      </w:r>
+      <w:r>
+        <w:t xml:space="preserve"> форматировали его через </w:t>
+      </w:r>
+      <w:proofErr w:type="spellStart"/>
+      <w:r>
+        <w:rPr>
+          <w:rStyle w:val="a4"/>
+        </w:rPr>
         <w:t>Prettier</w:t>
       </w:r>
       <w:proofErr w:type="spellEnd"/>
       <w:r>
-        <w:t xml:space="preserve">, а за Git-хуки отвечал </w:t>
+        <w:t>. З</w:t>
+      </w:r>
+      <w:r>
+        <w:t xml:space="preserve">а Git-хуки отвечал </w:t>
       </w:r>
       <w:proofErr w:type="spellStart"/>
       <w:r>
@@ -3091,7 +3099,6 @@
       </w:pPr>
       <w:proofErr w:type="spellStart"/>
       <w:r>
-        <w:lastRenderedPageBreak/>
         <w:t>Использвали</w:t>
       </w:r>
       <w:proofErr w:type="spellEnd"/>
@@ -3216,7 +3223,16 @@
           <w:szCs w:val="24"/>
           <w:lang w:eastAsia="ru-RU"/>
         </w:rPr>
-        <w:t xml:space="preserve"> → </w:t>
+        <w:t xml:space="preserve"> —</w:t>
+      </w:r>
+      <w:r>
+        <w:rPr>
+          <w:rFonts w:ascii="Times New Roman" w:eastAsia="Times New Roman" w:hAnsi="Times New Roman" w:cs="Times New Roman"/>
+          <w:sz w:val="24"/>
+          <w:szCs w:val="24"/>
+          <w:lang w:eastAsia="ru-RU"/>
+        </w:rPr>
+        <w:t xml:space="preserve"> </w:t>
       </w:r>
       <w:r>
         <w:rPr>
@@ -3283,7 +3299,16 @@
           <w:szCs w:val="24"/>
           <w:lang w:eastAsia="ru-RU"/>
         </w:rPr>
-        <w:t xml:space="preserve"> → преобразование потоков в удобное состояние</w:t>
+        <w:t xml:space="preserve"> —</w:t>
+      </w:r>
+      <w:r>
+        <w:rPr>
+          <w:rFonts w:ascii="Times New Roman" w:eastAsia="Times New Roman" w:hAnsi="Times New Roman" w:cs="Times New Roman"/>
+          <w:sz w:val="24"/>
+          <w:szCs w:val="24"/>
+          <w:lang w:eastAsia="ru-RU"/>
+        </w:rPr>
+        <w:t xml:space="preserve"> преобразование потоков в удобное состояние</w:t>
       </w:r>
       <w:r>
         <w:rPr>
@@ -3388,7 +3413,16 @@
           <w:szCs w:val="24"/>
           <w:lang w:eastAsia="ru-RU"/>
         </w:rPr>
-        <w:t xml:space="preserve"> → локальное управление состоянием UI.</w:t>
+        <w:t xml:space="preserve"> —</w:t>
+      </w:r>
+      <w:r>
+        <w:rPr>
+          <w:rFonts w:ascii="Times New Roman" w:eastAsia="Times New Roman" w:hAnsi="Times New Roman" w:cs="Times New Roman"/>
+          <w:sz w:val="24"/>
+          <w:szCs w:val="24"/>
+          <w:lang w:eastAsia="ru-RU"/>
+        </w:rPr>
+        <w:t xml:space="preserve"> локальное управление состоянием UI.</w:t>
       </w:r>
     </w:p>
     <w:p>
@@ -3450,7 +3484,16 @@
           <w:szCs w:val="24"/>
           <w:lang w:eastAsia="ru-RU"/>
         </w:rPr>
-        <w:t xml:space="preserve"> → </w:t>
+        <w:t xml:space="preserve"> —</w:t>
+      </w:r>
+      <w:r>
+        <w:rPr>
+          <w:rFonts w:ascii="Times New Roman" w:eastAsia="Times New Roman" w:hAnsi="Times New Roman" w:cs="Times New Roman"/>
+          <w:sz w:val="24"/>
+          <w:szCs w:val="24"/>
+          <w:lang w:eastAsia="ru-RU"/>
+        </w:rPr>
+        <w:t xml:space="preserve"> </w:t>
       </w:r>
       <w:r>
         <w:rPr>
@@ -3532,6 +3575,9 @@
       </w:r>
       <w:proofErr w:type="spellEnd"/>
       <w:r>
+        <w:t xml:space="preserve"> и другие функции</w:t>
+      </w:r>
+      <w:r>
         <w:t>.</w:t>
       </w:r>
     </w:p>
@@ -3541,7 +3587,13 @@
         <w:ind w:firstLine="426"/>
       </w:pPr>
       <w:r>
-        <w:t xml:space="preserve">Чтобы удобнее использовать данные прямо в шаблонах, мы преобразуем </w:t>
+        <w:t>Чтобы удобнее использовать данные прямо в шаблонах, мы преобраз</w:t>
+      </w:r>
+      <w:r>
+        <w:t>овыва</w:t>
+      </w:r>
+      <w:r>
+        <w:t xml:space="preserve">ем </w:t>
       </w:r>
       <w:proofErr w:type="spellStart"/>
       <w:r>
@@ -3590,7 +3642,38 @@
         <w:ind w:firstLine="426"/>
       </w:pPr>
       <w:r>
-        <w:t xml:space="preserve">Для локального состояния — загрузка, фильтры, ошибки — мы используем </w:t>
+        <w:t xml:space="preserve">Для локального состояния </w:t>
+      </w:r>
+      <w:r>
+        <w:rPr>
+          <w:i/>
+          <w:strike/>
+        </w:rPr>
+        <w:t>(</w:t>
+      </w:r>
+      <w:r>
+        <w:rPr>
+          <w:i/>
+          <w:strike/>
+        </w:rPr>
+        <w:t>загрузка, фильтры, ошибки</w:t>
+      </w:r>
+      <w:r>
+        <w:rPr>
+          <w:i/>
+          <w:strike/>
+        </w:rPr>
+        <w:t>)</w:t>
+      </w:r>
+      <w:r>
+        <w:rPr>
+          <w:i/>
+          <w:strike/>
+        </w:rPr>
+        <w:t xml:space="preserve"> </w:t>
+      </w:r>
+      <w:r>
+        <w:t xml:space="preserve"> мы используем </w:t>
       </w:r>
       <w:proofErr w:type="spellStart"/>
       <w:r>
@@ -4231,6 +4314,7 @@
           <w:szCs w:val="24"/>
           <w:lang w:eastAsia="ru-RU"/>
         </w:rPr>
+        <w:lastRenderedPageBreak/>
         <w:t>При</w:t>
       </w:r>
       <w:r>
@@ -4588,7 +4672,6 @@
           <w:szCs w:val="24"/>
           <w:lang w:eastAsia="ru-RU"/>
         </w:rPr>
-        <w:lastRenderedPageBreak/>
         <w:t>Разделы главной страницы.</w:t>
       </w:r>
     </w:p>
@@ -5282,7 +5365,79 @@
           <w:szCs w:val="24"/>
           <w:lang w:eastAsia="ru-RU"/>
         </w:rPr>
-        <w:t>, чтобы проверять основные сценарии работы приложения.</w:t>
+        <w:t>, чтобы проверять осно</w:t>
+      </w:r>
+      <w:r>
+        <w:rPr>
+          <w:rFonts w:ascii="Times New Roman" w:eastAsia="Times New Roman" w:hAnsi="Times New Roman" w:cs="Times New Roman"/>
+          <w:sz w:val="24"/>
+          <w:szCs w:val="24"/>
+          <w:lang w:eastAsia="ru-RU"/>
+        </w:rPr>
+        <w:t>вные сценарии работы приложения, так</w:t>
+      </w:r>
+      <w:r>
+        <w:rPr>
+          <w:rFonts w:ascii="Times New Roman" w:eastAsia="Times New Roman" w:hAnsi="Times New Roman" w:cs="Times New Roman"/>
+          <w:sz w:val="24"/>
+          <w:szCs w:val="24"/>
+          <w:lang w:eastAsia="ru-RU"/>
+        </w:rPr>
+        <w:t xml:space="preserve">же </w:t>
+      </w:r>
+      <w:r>
+        <w:rPr>
+          <w:rFonts w:ascii="Times New Roman" w:hAnsi="Times New Roman" w:cs="Times New Roman"/>
+          <w:sz w:val="24"/>
+          <w:szCs w:val="24"/>
+        </w:rPr>
+        <w:t xml:space="preserve">создавались </w:t>
+      </w:r>
+      <w:proofErr w:type="spellStart"/>
+      <w:r>
+        <w:rPr>
+          <w:rFonts w:ascii="Times New Roman" w:hAnsi="Times New Roman" w:cs="Times New Roman"/>
+          <w:sz w:val="24"/>
+          <w:szCs w:val="24"/>
+        </w:rPr>
+        <w:t>моковые</w:t>
+      </w:r>
+      <w:proofErr w:type="spellEnd"/>
+      <w:r>
+        <w:rPr>
+          <w:rFonts w:ascii="Times New Roman" w:hAnsi="Times New Roman" w:cs="Times New Roman"/>
+          <w:sz w:val="24"/>
+          <w:szCs w:val="24"/>
+        </w:rPr>
+        <w:t xml:space="preserve"> данные (</w:t>
+      </w:r>
+      <w:r>
+        <w:rPr>
+          <w:rFonts w:ascii="Times New Roman" w:hAnsi="Times New Roman" w:cs="Times New Roman"/>
+          <w:i/>
+          <w:sz w:val="24"/>
+          <w:szCs w:val="24"/>
+        </w:rPr>
+        <w:t xml:space="preserve">карточки фильмов, для директив - </w:t>
+      </w:r>
+      <w:proofErr w:type="spellStart"/>
+      <w:r>
+        <w:rPr>
+          <w:rFonts w:ascii="Times New Roman" w:hAnsi="Times New Roman" w:cs="Times New Roman"/>
+          <w:i/>
+          <w:sz w:val="24"/>
+          <w:szCs w:val="24"/>
+        </w:rPr>
+        <w:t>hostComponents</w:t>
+      </w:r>
+      <w:proofErr w:type="spellEnd"/>
+      <w:r>
+        <w:rPr>
+          <w:rFonts w:ascii="Times New Roman" w:hAnsi="Times New Roman" w:cs="Times New Roman"/>
+          <w:sz w:val="24"/>
+          <w:szCs w:val="24"/>
+        </w:rPr>
+        <w:t>)</w:t>
       </w:r>
     </w:p>
     <w:p>
@@ -5879,6 +6034,7 @@
           <w:color w:val="00B050"/>
           <w:u w:val="single"/>
         </w:rPr>
+        <w:lastRenderedPageBreak/>
         <w:t>Речь:</w:t>
       </w:r>
       <w:r>
@@ -6109,7 +6265,6 @@
           <w:szCs w:val="36"/>
           <w:lang w:eastAsia="ru-RU"/>
         </w:rPr>
-        <w:lastRenderedPageBreak/>
         <w:pict>
           <v:rect id="_x0000_i1038" style="width:0;height:1.5pt" o:hralign="center" o:hrstd="t" o:hr="t" fillcolor="#a0a0a0" stroked="f"/>
         </w:pict>
@@ -6196,32 +6351,7 @@
     </w:p>
     <w:p>
       <w:pPr>
-        <w:pStyle w:val="a3"/>
-        <w:numPr>
-          <w:ilvl w:val="0"/>
-          <w:numId w:val="17"/>
-        </w:numPr>
-      </w:pPr>
-      <w:r>
-        <w:t xml:space="preserve">Пример </w:t>
-      </w:r>
-      <w:proofErr w:type="spellStart"/>
-      <w:r>
-        <w:t>captureException</w:t>
-      </w:r>
-      <w:proofErr w:type="spellEnd"/>
-    </w:p>
-    <w:p>
-      <w:pPr>
         <w:spacing w:before="100" w:beforeAutospacing="1" w:after="100" w:afterAutospacing="1" w:line="240" w:lineRule="auto"/>
-        <w:rPr>
-          <w:rFonts w:ascii="Times New Roman" w:eastAsia="Times New Roman" w:hAnsi="Times New Roman" w:cs="Times New Roman"/>
-          <w:sz w:val="24"/>
-          <w:szCs w:val="24"/>
-          <w:lang w:eastAsia="ru-RU"/>
-        </w:rPr>
-      </w:pPr>
-      <w:r>
         <w:rPr>
           <w:rFonts w:ascii="Times New Roman" w:eastAsia="Times New Roman" w:hAnsi="Times New Roman" w:cs="Times New Roman"/>
           <w:b/>
@@ -6229,115 +6359,9 @@
           <w:sz w:val="24"/>
           <w:szCs w:val="24"/>
           <w:u w:val="single"/>
-          <w:lang w:eastAsia="ru-RU"/>
-        </w:rPr>
-        <w:t>Речь:</w:t>
-      </w:r>
-      <w:r>
-        <w:rPr>
-          <w:rFonts w:ascii="Times New Roman" w:eastAsia="Times New Roman" w:hAnsi="Times New Roman" w:cs="Times New Roman"/>
-          <w:sz w:val="24"/>
-          <w:szCs w:val="24"/>
-          <w:lang w:eastAsia="ru-RU"/>
-        </w:rPr>
-        <w:br/>
-        <w:t xml:space="preserve">Для мониторинга ошибок мы подключили </w:t>
-      </w:r>
-      <w:proofErr w:type="spellStart"/>
-      <w:r>
-        <w:rPr>
-          <w:rFonts w:ascii="Times New Roman" w:eastAsia="Times New Roman" w:hAnsi="Times New Roman" w:cs="Times New Roman"/>
-          <w:b/>
-          <w:bCs/>
-          <w:sz w:val="24"/>
-          <w:szCs w:val="24"/>
-          <w:lang w:eastAsia="ru-RU"/>
-        </w:rPr>
-        <w:t>Sentry</w:t>
-      </w:r>
-      <w:proofErr w:type="spellEnd"/>
-      <w:r>
-        <w:rPr>
-          <w:rFonts w:ascii="Times New Roman" w:eastAsia="Times New Roman" w:hAnsi="Times New Roman" w:cs="Times New Roman"/>
-          <w:sz w:val="24"/>
-          <w:szCs w:val="24"/>
-          <w:lang w:eastAsia="ru-RU"/>
-        </w:rPr>
-        <w:t>.</w:t>
-      </w:r>
-      <w:r>
-        <w:rPr>
-          <w:rFonts w:ascii="Times New Roman" w:eastAsia="Times New Roman" w:hAnsi="Times New Roman" w:cs="Times New Roman"/>
-          <w:sz w:val="24"/>
-          <w:szCs w:val="24"/>
-          <w:lang w:eastAsia="ru-RU"/>
-        </w:rPr>
-        <w:br/>
-        <w:t xml:space="preserve">Если в приложении возникает ошибка, она автоматически отправляется на сервер </w:t>
-      </w:r>
-      <w:proofErr w:type="spellStart"/>
-      <w:r>
-        <w:rPr>
-          <w:rFonts w:ascii="Times New Roman" w:eastAsia="Times New Roman" w:hAnsi="Times New Roman" w:cs="Times New Roman"/>
-          <w:sz w:val="24"/>
-          <w:szCs w:val="24"/>
-          <w:lang w:eastAsia="ru-RU"/>
-        </w:rPr>
-        <w:t>Sentry</w:t>
-      </w:r>
-      <w:proofErr w:type="spellEnd"/>
-      <w:r>
-        <w:rPr>
-          <w:rFonts w:ascii="Times New Roman" w:eastAsia="Times New Roman" w:hAnsi="Times New Roman" w:cs="Times New Roman"/>
-          <w:sz w:val="24"/>
-          <w:szCs w:val="24"/>
-          <w:lang w:eastAsia="ru-RU"/>
-        </w:rPr>
-        <w:t>, где мы можем отследить стек вызовов и быстро найти проблему.</w:t>
-      </w:r>
-    </w:p>
-    <w:p>
-      <w:r>
-        <w:pict>
-          <v:rect id="_x0000_i1039" style="width:0;height:1.5pt" o:hralign="center" o:hrstd="t" o:hr="t" fillcolor="#a0a0a0" stroked="f"/>
-        </w:pict>
-      </w:r>
-    </w:p>
-    <w:p>
-      <w:pPr>
-        <w:spacing w:before="100" w:beforeAutospacing="1" w:after="100" w:afterAutospacing="1" w:line="240" w:lineRule="auto"/>
-        <w:outlineLvl w:val="1"/>
-        <w:rPr>
-          <w:rFonts w:ascii="Times New Roman" w:eastAsia="Times New Roman" w:hAnsi="Times New Roman" w:cs="Times New Roman"/>
-          <w:b/>
-          <w:bCs/>
-          <w:sz w:val="36"/>
-          <w:szCs w:val="36"/>
-          <w:lang w:eastAsia="ru-RU"/>
-        </w:rPr>
-      </w:pPr>
-      <w:r>
-        <w:rPr>
-          <w:rFonts w:ascii="Times New Roman" w:eastAsia="Times New Roman" w:hAnsi="Times New Roman" w:cs="Times New Roman"/>
-          <w:b/>
-          <w:bCs/>
-          <w:sz w:val="36"/>
-          <w:szCs w:val="36"/>
-          <w:lang w:eastAsia="ru-RU"/>
-        </w:rPr>
-        <w:t>12</w:t>
-      </w:r>
-      <w:r>
-        <w:rPr>
-          <w:rFonts w:ascii="Times New Roman" w:eastAsia="Times New Roman" w:hAnsi="Times New Roman" w:cs="Times New Roman"/>
-          <w:b/>
-          <w:bCs/>
-          <w:sz w:val="36"/>
-          <w:szCs w:val="36"/>
-          <w:lang w:eastAsia="ru-RU"/>
-        </w:rPr>
-        <w:t>. Оптимизация и производительность</w:t>
-      </w:r>
+          <w:lang w:val="en-US" w:eastAsia="ru-RU"/>
+        </w:rPr>
+      </w:pPr>
       <w:r>
         <w:rPr>
           <w:rFonts w:ascii="Times New Roman" w:eastAsia="Times New Roman" w:hAnsi="Times New Roman" w:cs="Times New Roman"/>
@@ -6347,10 +6371,10 @@
           <w:lang w:eastAsia="ru-RU"/>
         </w:rPr>
         <w:drawing>
-          <wp:inline distT="0" distB="0" distL="0" distR="0">
-            <wp:extent cx="3700732" cy="812506"/>
-            <wp:effectExtent l="0" t="0" r="0" b="6985"/>
-            <wp:docPr id="3" name="Рисунок 3" descr="C:\Users\User\AppData\Local\Microsoft\Windows\INetCache\Content.Word\LighthouseFinal.png"/>
+          <wp:inline distT="0" distB="0" distL="0" distR="0" wp14:anchorId="446B6173" wp14:editId="66864E91">
+            <wp:extent cx="5400600" cy="3909127"/>
+            <wp:effectExtent l="0" t="0" r="0" b="0"/>
+            <wp:docPr id="1026" name="Picture 2"/>
             <wp:cNvGraphicFramePr>
               <a:graphicFrameLocks xmlns:a="http://schemas.openxmlformats.org/drawingml/2006/main" noChangeAspect="1"/>
             </wp:cNvGraphicFramePr>
@@ -6358,7 +6382,7 @@
               <a:graphicData uri="http://schemas.openxmlformats.org/drawingml/2006/picture">
                 <pic:pic xmlns:pic="http://schemas.openxmlformats.org/drawingml/2006/picture">
                   <pic:nvPicPr>
-                    <pic:cNvPr id="0" name="Picture 102" descr="C:\Users\User\AppData\Local\Microsoft\Windows\INetCache\Content.Word\LighthouseFinal.png"/>
+                    <pic:cNvPr id="1026" name="Picture 2"/>
                     <pic:cNvPicPr>
                       <a:picLocks noChangeAspect="1" noChangeArrowheads="1"/>
                     </pic:cNvPicPr>
@@ -6379,7 +6403,7 @@
                   <pic:spPr bwMode="auto">
                     <a:xfrm>
                       <a:off x="0" y="0"/>
-                      <a:ext cx="3698593" cy="812036"/>
+                      <a:ext cx="5400600" cy="3909127"/>
                     </a:xfrm>
                     <a:prstGeom prst="rect">
                       <a:avLst/>
@@ -6388,6 +6412,35 @@
                     <a:ln>
                       <a:noFill/>
                     </a:ln>
+                    <a:effectLst/>
+                    <a:extLst>
+                      <a:ext uri="{909E8E84-426E-40DD-AFC4-6F175D3DCCD1}">
+                        <a14:hiddenFill xmlns:a14="http://schemas.microsoft.com/office/drawing/2010/main">
+                          <a:solidFill>
+                            <a:schemeClr val="accent1"/>
+                          </a:solidFill>
+                        </a14:hiddenFill>
+                      </a:ext>
+                      <a:ext uri="{91240B29-F687-4F45-9708-019B960494DF}">
+                        <a14:hiddenLine xmlns:a14="http://schemas.microsoft.com/office/drawing/2010/main" w="9525">
+                          <a:solidFill>
+                            <a:schemeClr val="tx1"/>
+                          </a:solidFill>
+                          <a:miter lim="800000"/>
+                          <a:headEnd/>
+                          <a:tailEnd/>
+                        </a14:hiddenLine>
+                      </a:ext>
+                      <a:ext uri="{AF507438-7753-43E0-B8FC-AC1667EBCBE1}">
+                        <a14:hiddenEffects xmlns:a14="http://schemas.microsoft.com/office/drawing/2010/main">
+                          <a:effectLst>
+                            <a:outerShdw dist="35921" dir="2700000" algn="ctr" rotWithShape="0">
+                              <a:schemeClr val="bg2"/>
+                            </a:outerShdw>
+                          </a:effectLst>
+                        </a14:hiddenEffects>
+                      </a:ext>
+                    </a:extLst>
                   </pic:spPr>
                 </pic:pic>
               </a:graphicData>
@@ -6399,22 +6452,86 @@
     <w:p>
       <w:pPr>
         <w:spacing w:before="100" w:beforeAutospacing="1" w:after="100" w:afterAutospacing="1" w:line="240" w:lineRule="auto"/>
-        <w:ind w:left="720"/>
-        <w:rPr>
-          <w:rFonts w:ascii="Times New Roman" w:eastAsia="Times New Roman" w:hAnsi="Times New Roman" w:cs="Times New Roman"/>
-          <w:sz w:val="24"/>
-          <w:szCs w:val="24"/>
-          <w:lang w:eastAsia="ru-RU"/>
-        </w:rPr>
-      </w:pPr>
-      <w:r>
-        <w:rPr>
-          <w:rFonts w:ascii="Times New Roman" w:eastAsia="Times New Roman" w:hAnsi="Times New Roman" w:cs="Times New Roman"/>
-          <w:sz w:val="24"/>
-          <w:szCs w:val="24"/>
-          <w:lang w:val="en-US" w:eastAsia="ru-RU"/>
-        </w:rPr>
-        <w:t>Lighthouse</w:t>
+        <w:rPr>
+          <w:rFonts w:ascii="Times New Roman" w:eastAsia="Times New Roman" w:hAnsi="Times New Roman" w:cs="Times New Roman"/>
+          <w:sz w:val="24"/>
+          <w:szCs w:val="24"/>
+          <w:lang w:eastAsia="ru-RU"/>
+        </w:rPr>
+      </w:pPr>
+      <w:r>
+        <w:rPr>
+          <w:rFonts w:ascii="Times New Roman" w:eastAsia="Times New Roman" w:hAnsi="Times New Roman" w:cs="Times New Roman"/>
+          <w:b/>
+          <w:color w:val="00B050"/>
+          <w:sz w:val="24"/>
+          <w:szCs w:val="24"/>
+          <w:u w:val="single"/>
+          <w:lang w:eastAsia="ru-RU"/>
+        </w:rPr>
+        <w:t>Речь:</w:t>
+      </w:r>
+      <w:r>
+        <w:rPr>
+          <w:rFonts w:ascii="Times New Roman" w:eastAsia="Times New Roman" w:hAnsi="Times New Roman" w:cs="Times New Roman"/>
+          <w:sz w:val="24"/>
+          <w:szCs w:val="24"/>
+          <w:lang w:eastAsia="ru-RU"/>
+        </w:rPr>
+        <w:br/>
+        <w:t xml:space="preserve">Для мониторинга ошибок мы подключили </w:t>
+      </w:r>
+      <w:proofErr w:type="spellStart"/>
+      <w:r>
+        <w:rPr>
+          <w:rFonts w:ascii="Times New Roman" w:eastAsia="Times New Roman" w:hAnsi="Times New Roman" w:cs="Times New Roman"/>
+          <w:b/>
+          <w:bCs/>
+          <w:sz w:val="24"/>
+          <w:szCs w:val="24"/>
+          <w:lang w:eastAsia="ru-RU"/>
+        </w:rPr>
+        <w:t>Sentry</w:t>
+      </w:r>
+      <w:proofErr w:type="spellEnd"/>
+      <w:r>
+        <w:rPr>
+          <w:rFonts w:ascii="Times New Roman" w:eastAsia="Times New Roman" w:hAnsi="Times New Roman" w:cs="Times New Roman"/>
+          <w:sz w:val="24"/>
+          <w:szCs w:val="24"/>
+          <w:lang w:eastAsia="ru-RU"/>
+        </w:rPr>
+        <w:t>.</w:t>
+      </w:r>
+      <w:r>
+        <w:rPr>
+          <w:rFonts w:ascii="Times New Roman" w:eastAsia="Times New Roman" w:hAnsi="Times New Roman" w:cs="Times New Roman"/>
+          <w:sz w:val="24"/>
+          <w:szCs w:val="24"/>
+          <w:lang w:eastAsia="ru-RU"/>
+        </w:rPr>
+        <w:br/>
+        <w:t xml:space="preserve">Если в приложении возникает ошибка, она автоматически отправляется на сервер </w:t>
+      </w:r>
+      <w:proofErr w:type="spellStart"/>
+      <w:r>
+        <w:rPr>
+          <w:rFonts w:ascii="Times New Roman" w:eastAsia="Times New Roman" w:hAnsi="Times New Roman" w:cs="Times New Roman"/>
+          <w:sz w:val="24"/>
+          <w:szCs w:val="24"/>
+          <w:lang w:eastAsia="ru-RU"/>
+        </w:rPr>
+        <w:t>Sentry</w:t>
+      </w:r>
+      <w:proofErr w:type="spellEnd"/>
+      <w:r>
+        <w:rPr>
+          <w:rFonts w:ascii="Times New Roman" w:eastAsia="Times New Roman" w:hAnsi="Times New Roman" w:cs="Times New Roman"/>
+          <w:sz w:val="24"/>
+          <w:szCs w:val="24"/>
+          <w:lang w:eastAsia="ru-RU"/>
+        </w:rPr>
+        <w:t>, где мы можем отследить стек вызовов и быстро найти проблему.</w:t>
       </w:r>
       <w:r>
         <w:rPr>
@@ -6432,7 +6549,203 @@
           <w:szCs w:val="24"/>
           <w:lang w:eastAsia="ru-RU"/>
         </w:rPr>
-        <w:t>результаты</w:t>
+        <w:t xml:space="preserve">Кроме ошибок можно </w:t>
+      </w:r>
+      <w:proofErr w:type="spellStart"/>
+      <w:r>
+        <w:rPr>
+          <w:rFonts w:ascii="Times New Roman" w:eastAsia="Times New Roman" w:hAnsi="Times New Roman" w:cs="Times New Roman"/>
+          <w:sz w:val="24"/>
+          <w:szCs w:val="24"/>
+          <w:lang w:eastAsia="ru-RU"/>
+        </w:rPr>
+        <w:t>логировать</w:t>
+      </w:r>
+      <w:proofErr w:type="spellEnd"/>
+      <w:r>
+        <w:rPr>
+          <w:rFonts w:ascii="Times New Roman" w:eastAsia="Times New Roman" w:hAnsi="Times New Roman" w:cs="Times New Roman"/>
+          <w:sz w:val="24"/>
+          <w:szCs w:val="24"/>
+          <w:lang w:eastAsia="ru-RU"/>
+        </w:rPr>
+        <w:t xml:space="preserve"> и что-то другое (</w:t>
+      </w:r>
+      <w:r>
+        <w:rPr>
+          <w:rFonts w:ascii="Times New Roman" w:eastAsia="Times New Roman" w:hAnsi="Times New Roman" w:cs="Times New Roman"/>
+          <w:i/>
+          <w:sz w:val="24"/>
+          <w:szCs w:val="24"/>
+          <w:lang w:val="en-US" w:eastAsia="ru-RU"/>
+        </w:rPr>
+        <w:t>warning</w:t>
+      </w:r>
+      <w:r>
+        <w:rPr>
+          <w:rFonts w:ascii="Times New Roman" w:eastAsia="Times New Roman" w:hAnsi="Times New Roman" w:cs="Times New Roman"/>
+          <w:i/>
+          <w:sz w:val="24"/>
+          <w:szCs w:val="24"/>
+          <w:lang w:eastAsia="ru-RU"/>
+        </w:rPr>
+        <w:t xml:space="preserve">, </w:t>
+      </w:r>
+      <w:r>
+        <w:rPr>
+          <w:rFonts w:ascii="Times New Roman" w:eastAsia="Times New Roman" w:hAnsi="Times New Roman" w:cs="Times New Roman"/>
+          <w:i/>
+          <w:sz w:val="24"/>
+          <w:szCs w:val="24"/>
+          <w:lang w:val="en-US" w:eastAsia="ru-RU"/>
+        </w:rPr>
+        <w:t>log</w:t>
+      </w:r>
+      <w:r>
+        <w:rPr>
+          <w:rFonts w:ascii="Times New Roman" w:eastAsia="Times New Roman" w:hAnsi="Times New Roman" w:cs="Times New Roman"/>
+          <w:sz w:val="24"/>
+          <w:szCs w:val="24"/>
+          <w:lang w:eastAsia="ru-RU"/>
+        </w:rPr>
+        <w:t>).</w:t>
+      </w:r>
+    </w:p>
+    <w:p>
+      <w:r>
+        <w:pict>
+          <v:rect id="_x0000_i1039" style="width:0;height:1.5pt" o:hralign="center" o:hrstd="t" o:hr="t" fillcolor="#a0a0a0" stroked="f"/>
+        </w:pict>
+      </w:r>
+    </w:p>
+    <w:p>
+      <w:pPr>
+        <w:spacing w:before="100" w:beforeAutospacing="1" w:after="100" w:afterAutospacing="1" w:line="240" w:lineRule="auto"/>
+        <w:outlineLvl w:val="1"/>
+        <w:rPr>
+          <w:rFonts w:ascii="Times New Roman" w:eastAsia="Times New Roman" w:hAnsi="Times New Roman" w:cs="Times New Roman"/>
+          <w:b/>
+          <w:bCs/>
+          <w:sz w:val="36"/>
+          <w:szCs w:val="36"/>
+          <w:lang w:eastAsia="ru-RU"/>
+        </w:rPr>
+      </w:pPr>
+      <w:r>
+        <w:rPr>
+          <w:rFonts w:ascii="Times New Roman" w:eastAsia="Times New Roman" w:hAnsi="Times New Roman" w:cs="Times New Roman"/>
+          <w:b/>
+          <w:bCs/>
+          <w:sz w:val="36"/>
+          <w:szCs w:val="36"/>
+          <w:lang w:eastAsia="ru-RU"/>
+        </w:rPr>
+        <w:t>12</w:t>
+      </w:r>
+      <w:r>
+        <w:rPr>
+          <w:rFonts w:ascii="Times New Roman" w:eastAsia="Times New Roman" w:hAnsi="Times New Roman" w:cs="Times New Roman"/>
+          <w:b/>
+          <w:bCs/>
+          <w:sz w:val="36"/>
+          <w:szCs w:val="36"/>
+          <w:lang w:eastAsia="ru-RU"/>
+        </w:rPr>
+        <w:t>. Оптимизация и производительность</w:t>
+      </w:r>
+      <w:r>
+        <w:rPr>
+          <w:noProof/>
+          <w:lang w:eastAsia="ru-RU"/>
+        </w:rPr>
+        <w:t xml:space="preserve"> </w:t>
+      </w:r>
+      <w:r>
+        <w:rPr>
+          <w:rFonts w:ascii="Times New Roman" w:eastAsia="Times New Roman" w:hAnsi="Times New Roman" w:cs="Times New Roman"/>
+          <w:b/>
+          <w:bCs/>
+          <w:sz w:val="36"/>
+          <w:szCs w:val="36"/>
+          <w:lang w:eastAsia="ru-RU"/>
+        </w:rPr>
+        <w:drawing>
+          <wp:inline distT="0" distB="0" distL="0" distR="0" wp14:anchorId="10C08AAC" wp14:editId="4594B2AA">
+            <wp:extent cx="4429125" cy="971550"/>
+            <wp:effectExtent l="0" t="0" r="9525" b="0"/>
+            <wp:docPr id="2" name="Picture 2"/>
+            <wp:cNvGraphicFramePr>
+              <a:graphicFrameLocks xmlns:a="http://schemas.openxmlformats.org/drawingml/2006/main" noChangeAspect="1"/>
+            </wp:cNvGraphicFramePr>
+            <a:graphic xmlns:a="http://schemas.openxmlformats.org/drawingml/2006/main">
+              <a:graphicData uri="http://schemas.openxmlformats.org/drawingml/2006/picture">
+                <pic:pic xmlns:pic="http://schemas.openxmlformats.org/drawingml/2006/picture">
+                  <pic:nvPicPr>
+                    <pic:cNvPr id="1026" name="Picture 2"/>
+                    <pic:cNvPicPr>
+                      <a:picLocks noChangeAspect="1" noChangeArrowheads="1"/>
+                    </pic:cNvPicPr>
+                  </pic:nvPicPr>
+                  <pic:blipFill>
+                    <a:blip r:embed="rId14">
+                      <a:extLst>
+                        <a:ext uri="{28A0092B-C50C-407E-A947-70E740481C1C}">
+                          <a14:useLocalDpi xmlns:a14="http://schemas.microsoft.com/office/drawing/2010/main" val="0"/>
+                        </a:ext>
+                      </a:extLst>
+                    </a:blip>
+                    <a:srcRect/>
+                    <a:stretch>
+                      <a:fillRect/>
+                    </a:stretch>
+                  </pic:blipFill>
+                  <pic:spPr bwMode="auto">
+                    <a:xfrm>
+                      <a:off x="0" y="0"/>
+                      <a:ext cx="4429125" cy="971550"/>
+                    </a:xfrm>
+                    <a:prstGeom prst="rect">
+                      <a:avLst/>
+                    </a:prstGeom>
+                    <a:noFill/>
+                    <a:ln>
+                      <a:noFill/>
+                    </a:ln>
+                    <a:effectLst/>
+                    <a:extLst>
+                      <a:ext uri="{909E8E84-426E-40DD-AFC4-6F175D3DCCD1}">
+                        <a14:hiddenFill xmlns:a14="http://schemas.microsoft.com/office/drawing/2010/main">
+                          <a:solidFill>
+                            <a:schemeClr val="accent1"/>
+                          </a:solidFill>
+                        </a14:hiddenFill>
+                      </a:ext>
+                      <a:ext uri="{91240B29-F687-4F45-9708-019B960494DF}">
+                        <a14:hiddenLine xmlns:a14="http://schemas.microsoft.com/office/drawing/2010/main" w="9525">
+                          <a:solidFill>
+                            <a:schemeClr val="tx1"/>
+                          </a:solidFill>
+                          <a:miter lim="800000"/>
+                          <a:headEnd/>
+                          <a:tailEnd/>
+                        </a14:hiddenLine>
+                      </a:ext>
+                      <a:ext uri="{AF507438-7753-43E0-B8FC-AC1667EBCBE1}">
+                        <a14:hiddenEffects xmlns:a14="http://schemas.microsoft.com/office/drawing/2010/main">
+                          <a:effectLst>
+                            <a:outerShdw dist="35921" dir="2700000" algn="ctr" rotWithShape="0">
+                              <a:schemeClr val="bg2"/>
+                            </a:outerShdw>
+                          </a:effectLst>
+                        </a14:hiddenEffects>
+                      </a:ext>
+                    </a:extLst>
+                  </pic:spPr>
+                </pic:pic>
+              </a:graphicData>
+            </a:graphic>
+          </wp:inline>
+        </w:drawing>
       </w:r>
     </w:p>
     <w:p>
@@ -6451,13 +6764,10 @@
           <w:rFonts w:ascii="Times New Roman" w:eastAsia="Times New Roman" w:hAnsi="Times New Roman" w:cs="Times New Roman"/>
           <w:sz w:val="24"/>
           <w:szCs w:val="24"/>
-          <w:lang w:eastAsia="ru-RU"/>
-        </w:rPr>
-        <w:pict>
-          <v:shape id="_x0000_i1040" type="#_x0000_t75" style="width:187.45pt;height:127pt">
-            <v:imagedata r:id="rId14" o:title="Before-After"/>
-          </v:shape>
-        </w:pict>
+          <w:lang w:val="en-US" w:eastAsia="ru-RU"/>
+        </w:rPr>
+        <w:lastRenderedPageBreak/>
+        <w:t>Lighthouse</w:t>
       </w:r>
       <w:r>
         <w:rPr>
@@ -6467,6 +6777,15 @@
           <w:lang w:eastAsia="ru-RU"/>
         </w:rPr>
         <w:t xml:space="preserve"> </w:t>
+      </w:r>
+      <w:r>
+        <w:rPr>
+          <w:rFonts w:ascii="Times New Roman" w:eastAsia="Times New Roman" w:hAnsi="Times New Roman" w:cs="Times New Roman"/>
+          <w:sz w:val="24"/>
+          <w:szCs w:val="24"/>
+          <w:lang w:eastAsia="ru-RU"/>
+        </w:rPr>
+        <w:t>результаты</w:t>
       </w:r>
     </w:p>
     <w:p>
@@ -6487,6 +6806,59 @@
           <w:szCs w:val="24"/>
           <w:lang w:eastAsia="ru-RU"/>
         </w:rPr>
+        <w:drawing>
+          <wp:inline distT="0" distB="0" distL="0" distR="0" wp14:anchorId="6F1FEA18" wp14:editId="36648006">
+            <wp:extent cx="2493719" cy="2160240"/>
+            <wp:effectExtent l="0" t="0" r="1905" b="0"/>
+            <wp:docPr id="7" name="Рисунок 6"/>
+            <wp:cNvGraphicFramePr/>
+            <a:graphic xmlns:a="http://schemas.openxmlformats.org/drawingml/2006/main">
+              <a:graphicData uri="http://schemas.openxmlformats.org/drawingml/2006/picture">
+                <pic:pic xmlns:pic="http://schemas.openxmlformats.org/drawingml/2006/picture">
+                  <pic:nvPicPr>
+                    <pic:cNvPr id="7" name="Рисунок 6"/>
+                    <pic:cNvPicPr/>
+                  </pic:nvPicPr>
+                  <pic:blipFill>
+                    <a:blip r:embed="rId15"/>
+                    <a:stretch>
+                      <a:fillRect/>
+                    </a:stretch>
+                  </pic:blipFill>
+                  <pic:spPr>
+                    <a:xfrm>
+                      <a:off x="0" y="0"/>
+                      <a:ext cx="2493719" cy="2160240"/>
+                    </a:xfrm>
+                    <a:prstGeom prst="rect">
+                      <a:avLst/>
+                    </a:prstGeom>
+                  </pic:spPr>
+                </pic:pic>
+              </a:graphicData>
+            </a:graphic>
+          </wp:inline>
+        </w:drawing>
+      </w:r>
+    </w:p>
+    <w:p>
+      <w:pPr>
+        <w:spacing w:before="100" w:beforeAutospacing="1" w:after="100" w:afterAutospacing="1" w:line="240" w:lineRule="auto"/>
+        <w:ind w:left="720"/>
+        <w:rPr>
+          <w:rFonts w:ascii="Times New Roman" w:eastAsia="Times New Roman" w:hAnsi="Times New Roman" w:cs="Times New Roman"/>
+          <w:sz w:val="24"/>
+          <w:szCs w:val="24"/>
+          <w:lang w:eastAsia="ru-RU"/>
+        </w:rPr>
+      </w:pPr>
+      <w:r>
+        <w:rPr>
+          <w:rFonts w:ascii="Times New Roman" w:eastAsia="Times New Roman" w:hAnsi="Times New Roman" w:cs="Times New Roman"/>
+          <w:sz w:val="24"/>
+          <w:szCs w:val="24"/>
+          <w:lang w:eastAsia="ru-RU"/>
+        </w:rPr>
         <w:t>таблица</w:t>
       </w:r>
       <w:r>
@@ -6565,7 +6937,25 @@
           <w:szCs w:val="24"/>
           <w:lang w:eastAsia="ru-RU"/>
         </w:rPr>
-        <w:t xml:space="preserve">с 53 до 85 баллов в </w:t>
+        <w:t xml:space="preserve">с 53 до </w:t>
+      </w:r>
+      <w:r>
+        <w:rPr>
+          <w:rFonts w:ascii="Times New Roman" w:eastAsia="Times New Roman" w:hAnsi="Times New Roman" w:cs="Times New Roman"/>
+          <w:sz w:val="24"/>
+          <w:szCs w:val="24"/>
+          <w:lang w:eastAsia="ru-RU"/>
+        </w:rPr>
+        <w:t>96</w:t>
+      </w:r>
+      <w:r>
+        <w:rPr>
+          <w:rFonts w:ascii="Times New Roman" w:eastAsia="Times New Roman" w:hAnsi="Times New Roman" w:cs="Times New Roman"/>
+          <w:sz w:val="24"/>
+          <w:szCs w:val="24"/>
+          <w:lang w:eastAsia="ru-RU"/>
+        </w:rPr>
+        <w:t xml:space="preserve"> баллов в </w:t>
       </w:r>
       <w:proofErr w:type="spellStart"/>
       <w:r>
@@ -6607,7 +6997,7 @@
         </w:rPr>
         <w:t xml:space="preserve"> в </w:t>
       </w:r>
-      <w:hyperlink r:id="rId15" w:anchor="diff-2d2675bb4687601a5c7ccf707455132f90f3516a33716185687e5c41df59ac7d" w:tooltip="angular.json" w:history="1">
+      <w:hyperlink r:id="rId16" w:anchor="diff-2d2675bb4687601a5c7ccf707455132f90f3516a33716185687e5c41df59ac7d" w:tooltip="angular.json" w:history="1">
         <w:proofErr w:type="spellStart"/>
         <w:r>
           <w:rPr>
@@ -6639,7 +7029,7 @@
           <w:lang w:eastAsia="ru-RU"/>
         </w:rPr>
         <w:pict>
-          <v:rect id="_x0000_i1041" style="width:0;height:1.5pt" o:hralign="center" o:hrstd="t" o:hr="t" fillcolor="#a0a0a0" stroked="f"/>
+          <v:rect id="_x0000_i1040" style="width:0;height:1.5pt" o:hralign="center" o:hrstd="t" o:hr="t" fillcolor="#a0a0a0" stroked="f"/>
         </w:pict>
       </w:r>
     </w:p>
@@ -6881,7 +7271,25 @@
           <w:szCs w:val="24"/>
           <w:lang w:eastAsia="ru-RU"/>
         </w:rPr>
-        <w:t xml:space="preserve">. Мы много раз перепробовали разные конфигурации, </w:t>
+        <w:t xml:space="preserve">. </w:t>
+      </w:r>
+      <w:r>
+        <w:rPr>
+          <w:rFonts w:ascii="Times New Roman" w:eastAsia="Times New Roman" w:hAnsi="Times New Roman" w:cs="Times New Roman"/>
+          <w:sz w:val="24"/>
+          <w:szCs w:val="24"/>
+          <w:lang w:eastAsia="ru-RU"/>
+        </w:rPr>
+        <w:t>Пришлось много раз пробовать</w:t>
+      </w:r>
+      <w:r>
+        <w:rPr>
+          <w:rFonts w:ascii="Times New Roman" w:eastAsia="Times New Roman" w:hAnsi="Times New Roman" w:cs="Times New Roman"/>
+          <w:sz w:val="24"/>
+          <w:szCs w:val="24"/>
+          <w:lang w:eastAsia="ru-RU"/>
+        </w:rPr>
+        <w:t xml:space="preserve"> разные конфигурации, </w:t>
       </w:r>
       <w:r>
         <w:rPr>
@@ -6938,7 +7346,6 @@
           <w:szCs w:val="24"/>
           <w:lang w:eastAsia="ru-RU"/>
         </w:rPr>
-        <w:lastRenderedPageBreak/>
         <w:t xml:space="preserve">Второе — кроссплатформенность. На </w:t>
       </w:r>
       <w:proofErr w:type="spellStart"/>
@@ -7101,7 +7508,7 @@
           <w:lang w:eastAsia="ru-RU"/>
         </w:rPr>
         <w:pict>
-          <v:rect id="_x0000_i1042" style="width:0;height:1.5pt" o:hralign="center" o:hrstd="t" o:hr="t" fillcolor="#a0a0a0" stroked="f"/>
+          <v:rect id="_x0000_i1041" style="width:0;height:1.5pt" o:hralign="center" o:hrstd="t" o:hr="t" fillcolor="#a0a0a0" stroked="f"/>
         </w:pict>
       </w:r>
     </w:p>
@@ -7139,29 +7546,6 @@
           <w:lang w:eastAsia="ru-RU"/>
         </w:rPr>
         <w:t>. Что улучшить</w:t>
-      </w:r>
-      <w:r>
-        <w:rPr>
-          <w:rFonts w:ascii="Times New Roman" w:eastAsia="Times New Roman" w:hAnsi="Times New Roman" w:cs="Times New Roman"/>
-          <w:b/>
-          <w:bCs/>
-          <w:sz w:val="36"/>
-          <w:szCs w:val="36"/>
-          <w:lang w:eastAsia="ru-RU"/>
-        </w:rPr>
-        <w:t xml:space="preserve"> </w:t>
-      </w:r>
-      <w:r>
-        <w:rPr>
-          <w:rFonts w:ascii="Times New Roman" w:eastAsia="Times New Roman" w:hAnsi="Times New Roman" w:cs="Times New Roman"/>
-          <w:b/>
-          <w:bCs/>
-          <w:color w:val="FF0000"/>
-          <w:sz w:val="36"/>
-          <w:szCs w:val="36"/>
-          <w:lang w:eastAsia="ru-RU"/>
-        </w:rPr>
-        <w:t>(убрать?)</w:t>
       </w:r>
     </w:p>
     <w:p>
@@ -7209,8 +7593,19 @@
           <w:szCs w:val="24"/>
           <w:lang w:eastAsia="ru-RU"/>
         </w:rPr>
-        <w:t>Добавить рекомендации фильмов</w:t>
-      </w:r>
+        <w:t xml:space="preserve">Добавить </w:t>
+      </w:r>
+      <w:proofErr w:type="spellStart"/>
+      <w:r>
+        <w:rPr>
+          <w:rFonts w:ascii="Times New Roman" w:eastAsia="Times New Roman" w:hAnsi="Times New Roman" w:cs="Times New Roman"/>
+          <w:sz w:val="24"/>
+          <w:szCs w:val="24"/>
+          <w:lang w:eastAsia="ru-RU"/>
+        </w:rPr>
+        <w:t>многоязычность</w:t>
+      </w:r>
+      <w:proofErr w:type="spellEnd"/>
     </w:p>
     <w:p>
       <w:pPr>
@@ -7221,27 +7616,29 @@
         <w:spacing w:before="100" w:beforeAutospacing="1" w:after="100" w:afterAutospacing="1" w:line="240" w:lineRule="auto"/>
         <w:rPr>
           <w:rFonts w:ascii="Times New Roman" w:eastAsia="Times New Roman" w:hAnsi="Times New Roman" w:cs="Times New Roman"/>
-          <w:color w:val="FF0000"/>
-          <w:sz w:val="24"/>
-          <w:szCs w:val="24"/>
-          <w:lang w:eastAsia="ru-RU"/>
-        </w:rPr>
-      </w:pPr>
-      <w:r>
-        <w:rPr>
-          <w:rFonts w:ascii="Times New Roman" w:eastAsia="Times New Roman" w:hAnsi="Times New Roman" w:cs="Times New Roman"/>
-          <w:color w:val="FF0000"/>
-          <w:sz w:val="24"/>
-          <w:szCs w:val="24"/>
-          <w:lang w:eastAsia="ru-RU"/>
-        </w:rPr>
-        <w:t>Что-то ещё</w:t>
-      </w:r>
-    </w:p>
-    <w:p>
-      <w:pPr>
+          <w:sz w:val="24"/>
+          <w:szCs w:val="24"/>
+          <w:lang w:eastAsia="ru-RU"/>
+        </w:rPr>
+      </w:pPr>
+      <w:r>
+        <w:rPr>
+          <w:rFonts w:ascii="Times New Roman" w:eastAsia="Times New Roman" w:hAnsi="Times New Roman" w:cs="Times New Roman"/>
+          <w:bCs/>
+          <w:sz w:val="24"/>
+          <w:szCs w:val="24"/>
+          <w:lang w:eastAsia="ru-RU"/>
+        </w:rPr>
+        <w:t>Включить больше возможностей для выборки фильмов пользователями</w:t>
+      </w:r>
+    </w:p>
+    <w:p>
+      <w:pPr>
+        <w:numPr>
+          <w:ilvl w:val="0"/>
+          <w:numId w:val="13"/>
+        </w:numPr>
         <w:spacing w:before="100" w:beforeAutospacing="1" w:after="100" w:afterAutospacing="1" w:line="240" w:lineRule="auto"/>
-        <w:ind w:left="360"/>
         <w:rPr>
           <w:rFonts w:ascii="Times New Roman" w:eastAsia="Times New Roman" w:hAnsi="Times New Roman" w:cs="Times New Roman"/>
           <w:sz w:val="24"/>
@@ -7287,16 +7684,76 @@
           <w:szCs w:val="24"/>
           <w:lang w:eastAsia="ru-RU"/>
         </w:rPr>
-        <w:t>В будущем мы хотим расширить тестовое покрытие, добавить рекомендации и оп</w:t>
-      </w:r>
-      <w:r>
-        <w:rPr>
-          <w:rFonts w:ascii="Times New Roman" w:eastAsia="Times New Roman" w:hAnsi="Times New Roman" w:cs="Times New Roman"/>
-          <w:sz w:val="24"/>
-          <w:szCs w:val="24"/>
-          <w:lang w:eastAsia="ru-RU"/>
-        </w:rPr>
-        <w:t>тимизировать загрузку ресурсов.</w:t>
+        <w:t xml:space="preserve">В будущем мы хотим расширить тестовое покрытие, добавить </w:t>
+      </w:r>
+      <w:proofErr w:type="spellStart"/>
+      <w:r>
+        <w:rPr>
+          <w:rFonts w:ascii="Times New Roman" w:eastAsia="Times New Roman" w:hAnsi="Times New Roman" w:cs="Times New Roman"/>
+          <w:sz w:val="24"/>
+          <w:szCs w:val="24"/>
+          <w:lang w:eastAsia="ru-RU"/>
+        </w:rPr>
+        <w:t>многоязычность</w:t>
+      </w:r>
+      <w:proofErr w:type="spellEnd"/>
+      <w:r>
+        <w:rPr>
+          <w:rFonts w:ascii="Times New Roman" w:eastAsia="Times New Roman" w:hAnsi="Times New Roman" w:cs="Times New Roman"/>
+          <w:sz w:val="24"/>
+          <w:szCs w:val="24"/>
+          <w:lang w:eastAsia="ru-RU"/>
+        </w:rPr>
+        <w:t xml:space="preserve"> </w:t>
+      </w:r>
+      <w:r>
+        <w:rPr>
+          <w:rFonts w:ascii="Times New Roman" w:eastAsia="Times New Roman" w:hAnsi="Times New Roman" w:cs="Times New Roman"/>
+          <w:sz w:val="24"/>
+          <w:szCs w:val="24"/>
+          <w:lang w:eastAsia="ru-RU"/>
+        </w:rPr>
+        <w:t>и</w:t>
+      </w:r>
+      <w:proofErr w:type="gramStart"/>
+      <w:r>
+        <w:rPr>
+          <w:rFonts w:ascii="Times New Roman" w:eastAsia="Times New Roman" w:hAnsi="Times New Roman" w:cs="Times New Roman"/>
+          <w:sz w:val="24"/>
+          <w:szCs w:val="24"/>
+          <w:lang w:eastAsia="ru-RU"/>
+        </w:rPr>
+        <w:t xml:space="preserve"> </w:t>
+      </w:r>
+      <w:r>
+        <w:rPr>
+          <w:rFonts w:ascii="Times New Roman" w:eastAsia="Times New Roman" w:hAnsi="Times New Roman" w:cs="Times New Roman"/>
+          <w:bCs/>
+          <w:sz w:val="24"/>
+          <w:szCs w:val="24"/>
+          <w:lang w:eastAsia="ru-RU"/>
+        </w:rPr>
+        <w:t>В</w:t>
+      </w:r>
+      <w:proofErr w:type="gramEnd"/>
+      <w:r>
+        <w:rPr>
+          <w:rFonts w:ascii="Times New Roman" w:eastAsia="Times New Roman" w:hAnsi="Times New Roman" w:cs="Times New Roman"/>
+          <w:bCs/>
+          <w:sz w:val="24"/>
+          <w:szCs w:val="24"/>
+          <w:lang w:eastAsia="ru-RU"/>
+        </w:rPr>
+        <w:t>ключить больше возможностей для выборки фильмов пользователями</w:t>
+      </w:r>
+      <w:r>
+        <w:rPr>
+          <w:rFonts w:ascii="Times New Roman" w:eastAsia="Times New Roman" w:hAnsi="Times New Roman" w:cs="Times New Roman"/>
+          <w:sz w:val="24"/>
+          <w:szCs w:val="24"/>
+          <w:lang w:eastAsia="ru-RU"/>
+        </w:rPr>
+        <w:t>.</w:t>
       </w:r>
     </w:p>
     <w:p>
@@ -7317,7 +7774,7 @@
           <w:lang w:eastAsia="ru-RU"/>
         </w:rPr>
         <w:pict>
-          <v:rect id="_x0000_i1043" style="width:0;height:1.5pt" o:hralign="center" o:hrstd="t" o:hr="t" fillcolor="#a0a0a0" stroked="f"/>
+          <v:rect id="_x0000_i1042" style="width:0;height:1.5pt" o:hralign="center" o:hrstd="t" o:hr="t" fillcolor="#a0a0a0" stroked="f"/>
         </w:pict>
       </w:r>
     </w:p>
@@ -7378,6 +7835,7 @@
           <w:szCs w:val="24"/>
           <w:lang w:eastAsia="ru-RU"/>
         </w:rPr>
+        <w:lastRenderedPageBreak/>
         <w:t xml:space="preserve">Работа с </w:t>
       </w:r>
       <w:proofErr w:type="spellStart"/>
@@ -7815,6 +8273,15 @@
           <w:szCs w:val="24"/>
           <w:lang w:eastAsia="ru-RU"/>
         </w:rPr>
+        <w:t xml:space="preserve">опыт </w:t>
+      </w:r>
+      <w:r>
+        <w:rPr>
+          <w:rFonts w:ascii="Times New Roman" w:eastAsia="Times New Roman" w:hAnsi="Times New Roman" w:cs="Times New Roman"/>
+          <w:sz w:val="24"/>
+          <w:szCs w:val="24"/>
+          <w:lang w:eastAsia="ru-RU"/>
+        </w:rPr>
         <w:t>взаимодействия</w:t>
       </w:r>
       <w:r>
@@ -7903,7 +8370,7 @@
           <w:lang w:eastAsia="ru-RU"/>
         </w:rPr>
         <w:pict>
-          <v:rect id="_x0000_i1044" style="width:0;height:1.5pt" o:hralign="center" o:hrstd="t" o:hr="t" fillcolor="#a0a0a0" stroked="f"/>
+          <v:rect id="_x0000_i1043" style="width:0;height:1.5pt" o:hralign="center" o:hrstd="t" o:hr="t" fillcolor="#a0a0a0" stroked="f"/>
         </w:pict>
       </w:r>
     </w:p>
@@ -8122,7 +8589,10 @@
       </w:r>
       <w:proofErr w:type="gramEnd"/>
     </w:p>
-    <w:p/>
+    <w:p>
+      <w:bookmarkStart w:id="0" w:name="_GoBack"/>
+      <w:bookmarkEnd w:id="0"/>
+    </w:p>
     <w:sectPr>
       <w:pgSz w:w="11906" w:h="16838"/>
       <w:pgMar w:top="1134" w:right="850" w:bottom="284" w:left="1701" w:header="708" w:footer="708" w:gutter="0"/>
@@ -10633,6 +11103,146 @@
     </w:lvl>
   </w:abstractNum>
   <w:abstractNum w:abstractNumId="17">
+    <w:nsid w:val="74EE15E4"/>
+    <w:multiLevelType w:val="hybridMultilevel"/>
+    <w:tmpl w:val="FA1A5D5A"/>
+    <w:lvl w:ilvl="0" w:tplc="E33AB9AA">
+      <w:start w:val="1"/>
+      <w:numFmt w:val="bullet"/>
+      <w:lvlText w:val="•"/>
+      <w:lvlJc w:val="left"/>
+      <w:pPr>
+        <w:tabs>
+          <w:tab w:val="num" w:pos="720"/>
+        </w:tabs>
+        <w:ind w:left="720" w:hanging="360"/>
+      </w:pPr>
+      <w:rPr>
+        <w:rFonts w:ascii="Arial" w:hAnsi="Arial" w:hint="default"/>
+      </w:rPr>
+    </w:lvl>
+    <w:lvl w:ilvl="1" w:tplc="5FCED87E" w:tentative="1">
+      <w:start w:val="1"/>
+      <w:numFmt w:val="bullet"/>
+      <w:lvlText w:val="•"/>
+      <w:lvlJc w:val="left"/>
+      <w:pPr>
+        <w:tabs>
+          <w:tab w:val="num" w:pos="1440"/>
+        </w:tabs>
+        <w:ind w:left="1440" w:hanging="360"/>
+      </w:pPr>
+      <w:rPr>
+        <w:rFonts w:ascii="Arial" w:hAnsi="Arial" w:hint="default"/>
+      </w:rPr>
+    </w:lvl>
+    <w:lvl w:ilvl="2" w:tplc="E9CE1EDC" w:tentative="1">
+      <w:start w:val="1"/>
+      <w:numFmt w:val="bullet"/>
+      <w:lvlText w:val="•"/>
+      <w:lvlJc w:val="left"/>
+      <w:pPr>
+        <w:tabs>
+          <w:tab w:val="num" w:pos="2160"/>
+        </w:tabs>
+        <w:ind w:left="2160" w:hanging="360"/>
+      </w:pPr>
+      <w:rPr>
+        <w:rFonts w:ascii="Arial" w:hAnsi="Arial" w:hint="default"/>
+      </w:rPr>
+    </w:lvl>
+    <w:lvl w:ilvl="3" w:tplc="205CAD30" w:tentative="1">
+      <w:start w:val="1"/>
+      <w:numFmt w:val="bullet"/>
+      <w:lvlText w:val="•"/>
+      <w:lvlJc w:val="left"/>
+      <w:pPr>
+        <w:tabs>
+          <w:tab w:val="num" w:pos="2880"/>
+        </w:tabs>
+        <w:ind w:left="2880" w:hanging="360"/>
+      </w:pPr>
+      <w:rPr>
+        <w:rFonts w:ascii="Arial" w:hAnsi="Arial" w:hint="default"/>
+      </w:rPr>
+    </w:lvl>
+    <w:lvl w:ilvl="4" w:tplc="76EA71BC" w:tentative="1">
+      <w:start w:val="1"/>
+      <w:numFmt w:val="bullet"/>
+      <w:lvlText w:val="•"/>
+      <w:lvlJc w:val="left"/>
+      <w:pPr>
+        <w:tabs>
+          <w:tab w:val="num" w:pos="3600"/>
+        </w:tabs>
+        <w:ind w:left="3600" w:hanging="360"/>
+      </w:pPr>
+      <w:rPr>
+        <w:rFonts w:ascii="Arial" w:hAnsi="Arial" w:hint="default"/>
+      </w:rPr>
+    </w:lvl>
+    <w:lvl w:ilvl="5" w:tplc="92D0D574" w:tentative="1">
+      <w:start w:val="1"/>
+      <w:numFmt w:val="bullet"/>
+      <w:lvlText w:val="•"/>
+      <w:lvlJc w:val="left"/>
+      <w:pPr>
+        <w:tabs>
+          <w:tab w:val="num" w:pos="4320"/>
+        </w:tabs>
+        <w:ind w:left="4320" w:hanging="360"/>
+      </w:pPr>
+      <w:rPr>
+        <w:rFonts w:ascii="Arial" w:hAnsi="Arial" w:hint="default"/>
+      </w:rPr>
+    </w:lvl>
+    <w:lvl w:ilvl="6" w:tplc="6FDCD6B4" w:tentative="1">
+      <w:start w:val="1"/>
+      <w:numFmt w:val="bullet"/>
+      <w:lvlText w:val="•"/>
+      <w:lvlJc w:val="left"/>
+      <w:pPr>
+        <w:tabs>
+          <w:tab w:val="num" w:pos="5040"/>
+        </w:tabs>
+        <w:ind w:left="5040" w:hanging="360"/>
+      </w:pPr>
+      <w:rPr>
+        <w:rFonts w:ascii="Arial" w:hAnsi="Arial" w:hint="default"/>
+      </w:rPr>
+    </w:lvl>
+    <w:lvl w:ilvl="7" w:tplc="326CC4C4" w:tentative="1">
+      <w:start w:val="1"/>
+      <w:numFmt w:val="bullet"/>
+      <w:lvlText w:val="•"/>
+      <w:lvlJc w:val="left"/>
+      <w:pPr>
+        <w:tabs>
+          <w:tab w:val="num" w:pos="5760"/>
+        </w:tabs>
+        <w:ind w:left="5760" w:hanging="360"/>
+      </w:pPr>
+      <w:rPr>
+        <w:rFonts w:ascii="Arial" w:hAnsi="Arial" w:hint="default"/>
+      </w:rPr>
+    </w:lvl>
+    <w:lvl w:ilvl="8" w:tplc="4C10784E" w:tentative="1">
+      <w:start w:val="1"/>
+      <w:numFmt w:val="bullet"/>
+      <w:lvlText w:val="•"/>
+      <w:lvlJc w:val="left"/>
+      <w:pPr>
+        <w:tabs>
+          <w:tab w:val="num" w:pos="6480"/>
+        </w:tabs>
+        <w:ind w:left="6480" w:hanging="360"/>
+      </w:pPr>
+      <w:rPr>
+        <w:rFonts w:ascii="Arial" w:hAnsi="Arial" w:hint="default"/>
+      </w:rPr>
+    </w:lvl>
+  </w:abstractNum>
+  <w:abstractNum w:abstractNumId="18">
     <w:nsid w:val="7B705CA3"/>
     <w:multiLevelType w:val="multilevel"/>
     <w:tmpl w:val="6ACED48C"/>
@@ -10781,7 +11391,7 @@
       </w:rPr>
     </w:lvl>
   </w:abstractNum>
-  <w:abstractNum w:abstractNumId="18">
+  <w:abstractNum w:abstractNumId="19">
     <w:nsid w:val="7D516816"/>
     <w:multiLevelType w:val="multilevel"/>
     <w:tmpl w:val="DAD8374A"/>
@@ -10949,7 +11559,7 @@
     <w:abstractNumId w:val="1"/>
   </w:num>
   <w:num w:numId="7">
-    <w:abstractNumId w:val="17"/>
+    <w:abstractNumId w:val="18"/>
   </w:num>
   <w:num w:numId="8">
     <w:abstractNumId w:val="10"/>
@@ -10964,7 +11574,7 @@
     <w:abstractNumId w:val="0"/>
   </w:num>
   <w:num w:numId="12">
-    <w:abstractNumId w:val="18"/>
+    <w:abstractNumId w:val="19"/>
   </w:num>
   <w:num w:numId="13">
     <w:abstractNumId w:val="12"/>
@@ -10986,6 +11596,9 @@
   </w:num>
   <w:num w:numId="19">
     <w:abstractNumId w:val="14"/>
+  </w:num>
+  <w:num w:numId="20">
+    <w:abstractNumId w:val="17"/>
   </w:num>
 </w:numbering>
 </file>
@@ -11217,7 +11830,6 @@
   <w:style w:type="character" w:default="1" w:styleId="a0">
     <w:name w:val="Default Paragraph Font"/>
     <w:uiPriority w:val="1"/>
-    <w:semiHidden/>
     <w:unhideWhenUsed/>
   </w:style>
   <w:style w:type="table" w:default="1" w:styleId="a1">
@@ -11629,7 +12241,6 @@
   <w:style w:type="character" w:default="1" w:styleId="a0">
     <w:name w:val="Default Paragraph Font"/>
     <w:uiPriority w:val="1"/>
-    <w:semiHidden/>
     <w:unhideWhenUsed/>
   </w:style>
   <w:style w:type="table" w:default="1" w:styleId="a1">

</xml_diff>